<commit_message>
Updated ERD normalization and employee management module
</commit_message>
<xml_diff>
--- a/documentation/SRS.docx
+++ b/documentation/SRS.docx
@@ -10792,7 +10792,7 @@
                   </pic:nvPicPr>
                   <pic:blipFill>
                     <a:blip r:embed="rId6"/>
-                    <a:srcRect b="0" l="0" r="0" t="0"/>
+                    <a:srcRect b="0" l="1271" r="1271" t="0"/>
                     <a:stretch>
                       <a:fillRect/>
                     </a:stretch>
@@ -10832,404 +10832,11 @@
         </w:pBdr>
         <w:shd w:fill="ffffff" w:val="clear"/>
         <w:rPr>
-          <w:color w:val="0f4761"/>
-          <w:sz w:val="36"/>
-          <w:szCs w:val="36"/>
-          <w:shd w:fill="c6c6c6" w:val="clear"/>
-        </w:rPr>
-      </w:pPr>
-      <w:r>
-        <w:rPr>
           <w:b w:val="1"/>
           <w:bCs w:val="1"/>
           <w:color w:val="0f4761"/>
           <w:sz w:val="48"/>
           <w:szCs w:val="48"/>
-          <w:rtl w:val="0"/>
-        </w:rPr>
-        <w:t xml:space="preserve">10. User Interface (UI) Screens</w:t>
-      </w:r>
-      <w:r>
-        <w:rPr>
-          <w:color w:val="0f4761"/>
-          <w:sz w:val="48"/>
-          <w:szCs w:val="48"/>
-          <w:shd w:fill="c6c6c6" w:val="clear"/>
-          <w:rtl w:val="0"/>
-        </w:rPr>
-        <w:t xml:space="preserve"> </w:t>
-      </w:r>
-      <w:r>
-        <w:rPr>
-          <w:rtl w:val="0"/>
-        </w:rPr>
-      </w:r>
-    </w:p>
-    <w:p>
-      <w:pPr>
-        <w:pBdr>
-          <w:top w:color="auto" w:space="0" w:sz="0" w:val="none"/>
-          <w:bottom w:color="auto" w:space="0" w:sz="0" w:val="none"/>
-          <w:right w:color="auto" w:space="0" w:sz="0" w:val="none"/>
-          <w:between w:color="auto" w:space="0" w:sz="0" w:val="none"/>
-        </w:pBdr>
-        <w:ind w:left="720" w:firstLine="0"/>
-        <w:rPr>
-          <w:sz w:val="24"/>
-          <w:szCs w:val="24"/>
-          <w:shd w:fill="c6c6c6" w:val="clear"/>
-        </w:rPr>
-      </w:pPr>
-      <w:r>
-        <w:rPr>
-          <w:rtl w:val="0"/>
-        </w:rPr>
-      </w:r>
-    </w:p>
-    <w:p>
-      <w:pPr>
-        <w:pBdr>
-          <w:top w:color="auto" w:space="0" w:sz="0" w:val="none"/>
-          <w:bottom w:color="auto" w:space="0" w:sz="0" w:val="none"/>
-          <w:right w:color="auto" w:space="0" w:sz="0" w:val="none"/>
-          <w:between w:color="auto" w:space="0" w:sz="0" w:val="none"/>
-        </w:pBdr>
-        <w:ind w:left="720" w:firstLine="0"/>
-        <w:rPr>
-          <w:sz w:val="24"/>
-          <w:szCs w:val="24"/>
-        </w:rPr>
-      </w:pPr>
-      <w:r>
-        <w:rPr>
-          <w:sz w:val="24"/>
-          <w:szCs w:val="24"/>
-          <w:rtl w:val="0"/>
-        </w:rPr>
-        <w:t xml:space="preserve">• Login Page</w:t>
-      </w:r>
-    </w:p>
-    <w:p>
-      <w:pPr>
-        <w:pBdr>
-          <w:top w:color="auto" w:space="0" w:sz="0" w:val="none"/>
-          <w:bottom w:color="auto" w:space="0" w:sz="0" w:val="none"/>
-          <w:right w:color="auto" w:space="0" w:sz="0" w:val="none"/>
-          <w:between w:color="auto" w:space="0" w:sz="0" w:val="none"/>
-        </w:pBdr>
-        <w:ind w:left="720" w:firstLine="0"/>
-        <w:rPr>
-          <w:sz w:val="24"/>
-          <w:szCs w:val="24"/>
-        </w:rPr>
-      </w:pPr>
-      <w:r>
-        <w:rPr>
-          <w:sz w:val="24"/>
-          <w:szCs w:val="24"/>
-          <w:rtl w:val="0"/>
-        </w:rPr>
-        <w:t xml:space="preserve">• Dashboard</w:t>
-      </w:r>
-    </w:p>
-    <w:p>
-      <w:pPr>
-        <w:pBdr>
-          <w:top w:color="auto" w:space="0" w:sz="0" w:val="none"/>
-          <w:bottom w:color="auto" w:space="0" w:sz="0" w:val="none"/>
-          <w:right w:color="auto" w:space="0" w:sz="0" w:val="none"/>
-          <w:between w:color="auto" w:space="0" w:sz="0" w:val="none"/>
-        </w:pBdr>
-        <w:ind w:left="720" w:firstLine="0"/>
-        <w:rPr>
-          <w:sz w:val="24"/>
-          <w:szCs w:val="24"/>
-        </w:rPr>
-      </w:pPr>
-      <w:r>
-        <w:rPr>
-          <w:sz w:val="24"/>
-          <w:szCs w:val="24"/>
-          <w:rtl w:val="0"/>
-        </w:rPr>
-        <w:t xml:space="preserve">• Asset Management</w:t>
-      </w:r>
-    </w:p>
-    <w:p>
-      <w:pPr>
-        <w:pBdr>
-          <w:top w:color="auto" w:space="0" w:sz="0" w:val="none"/>
-          <w:bottom w:color="auto" w:space="0" w:sz="0" w:val="none"/>
-          <w:right w:color="auto" w:space="0" w:sz="0" w:val="none"/>
-          <w:between w:color="auto" w:space="0" w:sz="0" w:val="none"/>
-        </w:pBdr>
-        <w:ind w:left="720" w:firstLine="0"/>
-        <w:rPr>
-          <w:sz w:val="24"/>
-          <w:szCs w:val="24"/>
-        </w:rPr>
-      </w:pPr>
-      <w:r>
-        <w:rPr>
-          <w:sz w:val="24"/>
-          <w:szCs w:val="24"/>
-          <w:rtl w:val="0"/>
-        </w:rPr>
-        <w:t xml:space="preserve">• Employee Management</w:t>
-      </w:r>
-    </w:p>
-    <w:p>
-      <w:pPr>
-        <w:pBdr>
-          <w:top w:color="auto" w:space="0" w:sz="0" w:val="none"/>
-          <w:bottom w:color="auto" w:space="0" w:sz="0" w:val="none"/>
-          <w:right w:color="auto" w:space="0" w:sz="0" w:val="none"/>
-          <w:between w:color="auto" w:space="0" w:sz="0" w:val="none"/>
-        </w:pBdr>
-        <w:ind w:left="720" w:firstLine="0"/>
-        <w:rPr>
-          <w:sz w:val="24"/>
-          <w:szCs w:val="24"/>
-        </w:rPr>
-      </w:pPr>
-      <w:r>
-        <w:rPr>
-          <w:sz w:val="24"/>
-          <w:szCs w:val="24"/>
-          <w:rtl w:val="0"/>
-        </w:rPr>
-        <w:t xml:space="preserve">• Asset Assignment</w:t>
-      </w:r>
-    </w:p>
-    <w:p>
-      <w:pPr>
-        <w:pBdr>
-          <w:top w:color="auto" w:space="0" w:sz="0" w:val="none"/>
-          <w:bottom w:color="auto" w:space="0" w:sz="0" w:val="none"/>
-          <w:right w:color="auto" w:space="0" w:sz="0" w:val="none"/>
-          <w:between w:color="auto" w:space="0" w:sz="0" w:val="none"/>
-        </w:pBdr>
-        <w:ind w:left="720" w:firstLine="0"/>
-        <w:rPr>
-          <w:sz w:val="24"/>
-          <w:szCs w:val="24"/>
-        </w:rPr>
-      </w:pPr>
-      <w:r>
-        <w:rPr>
-          <w:sz w:val="24"/>
-          <w:szCs w:val="24"/>
-          <w:rtl w:val="0"/>
-        </w:rPr>
-        <w:t xml:space="preserve">• Maintenance Management</w:t>
-      </w:r>
-    </w:p>
-    <w:p>
-      <w:pPr>
-        <w:pBdr>
-          <w:top w:color="auto" w:space="0" w:sz="0" w:val="none"/>
-          <w:bottom w:color="auto" w:space="0" w:sz="0" w:val="none"/>
-          <w:right w:color="auto" w:space="0" w:sz="0" w:val="none"/>
-          <w:between w:color="auto" w:space="0" w:sz="0" w:val="none"/>
-        </w:pBdr>
-        <w:ind w:left="720" w:firstLine="0"/>
-        <w:rPr>
-          <w:sz w:val="24"/>
-          <w:szCs w:val="24"/>
-        </w:rPr>
-      </w:pPr>
-      <w:r>
-        <w:rPr>
-          <w:sz w:val="24"/>
-          <w:szCs w:val="24"/>
-          <w:rtl w:val="0"/>
-        </w:rPr>
-        <w:t xml:space="preserve">• Warranty Tracking</w:t>
-      </w:r>
-    </w:p>
-    <w:p>
-      <w:pPr>
-        <w:pBdr>
-          <w:top w:color="auto" w:space="0" w:sz="0" w:val="none"/>
-          <w:bottom w:color="auto" w:space="0" w:sz="0" w:val="none"/>
-          <w:right w:color="auto" w:space="0" w:sz="0" w:val="none"/>
-          <w:between w:color="auto" w:space="0" w:sz="0" w:val="none"/>
-        </w:pBdr>
-        <w:ind w:left="720" w:firstLine="0"/>
-        <w:rPr>
-          <w:sz w:val="24"/>
-          <w:szCs w:val="24"/>
-        </w:rPr>
-      </w:pPr>
-      <w:r>
-        <w:rPr>
-          <w:sz w:val="24"/>
-          <w:szCs w:val="24"/>
-          <w:rtl w:val="0"/>
-        </w:rPr>
-        <w:t xml:space="preserve">• Software License Tracking</w:t>
-      </w:r>
-    </w:p>
-    <w:p>
-      <w:pPr>
-        <w:pBdr>
-          <w:top w:color="auto" w:space="0" w:sz="0" w:val="none"/>
-          <w:bottom w:color="auto" w:space="0" w:sz="0" w:val="none"/>
-          <w:right w:color="auto" w:space="0" w:sz="0" w:val="none"/>
-          <w:between w:color="auto" w:space="0" w:sz="0" w:val="none"/>
-        </w:pBdr>
-        <w:ind w:left="720" w:firstLine="0"/>
-        <w:rPr>
-          <w:sz w:val="24"/>
-          <w:szCs w:val="24"/>
-        </w:rPr>
-      </w:pPr>
-      <w:r>
-        <w:rPr>
-          <w:sz w:val="24"/>
-          <w:szCs w:val="24"/>
-          <w:rtl w:val="0"/>
-        </w:rPr>
-        <w:t xml:space="preserve">• QR Code Management</w:t>
-      </w:r>
-    </w:p>
-    <w:p>
-      <w:pPr>
-        <w:pBdr>
-          <w:top w:color="auto" w:space="0" w:sz="0" w:val="none"/>
-          <w:bottom w:color="auto" w:space="0" w:sz="0" w:val="none"/>
-          <w:right w:color="auto" w:space="0" w:sz="0" w:val="none"/>
-          <w:between w:color="auto" w:space="0" w:sz="0" w:val="none"/>
-        </w:pBdr>
-        <w:ind w:left="720" w:firstLine="0"/>
-        <w:rPr>
-          <w:sz w:val="24"/>
-          <w:szCs w:val="24"/>
-        </w:rPr>
-      </w:pPr>
-      <w:r>
-        <w:rPr>
-          <w:sz w:val="24"/>
-          <w:szCs w:val="24"/>
-          <w:rtl w:val="0"/>
-        </w:rPr>
-        <w:t xml:space="preserve">• Inventory Dashboard</w:t>
-      </w:r>
-    </w:p>
-    <w:p>
-      <w:pPr>
-        <w:pBdr>
-          <w:top w:color="auto" w:space="0" w:sz="0" w:val="none"/>
-          <w:bottom w:color="auto" w:space="0" w:sz="0" w:val="none"/>
-          <w:right w:color="auto" w:space="0" w:sz="0" w:val="none"/>
-          <w:between w:color="auto" w:space="0" w:sz="0" w:val="none"/>
-        </w:pBdr>
-        <w:ind w:left="720" w:firstLine="0"/>
-        <w:rPr>
-          <w:sz w:val="24"/>
-          <w:szCs w:val="24"/>
-        </w:rPr>
-      </w:pPr>
-      <w:r>
-        <w:rPr>
-          <w:sz w:val="24"/>
-          <w:szCs w:val="24"/>
-          <w:rtl w:val="0"/>
-        </w:rPr>
-        <w:t xml:space="preserve">• Reports</w:t>
-      </w:r>
-    </w:p>
-    <w:p>
-      <w:pPr>
-        <w:pBdr>
-          <w:top w:color="auto" w:space="0" w:sz="0" w:val="none"/>
-          <w:bottom w:color="auto" w:space="0" w:sz="0" w:val="none"/>
-          <w:right w:color="auto" w:space="0" w:sz="0" w:val="none"/>
-          <w:between w:color="auto" w:space="0" w:sz="0" w:val="none"/>
-        </w:pBdr>
-        <w:ind w:left="720" w:firstLine="0"/>
-        <w:rPr>
-          <w:sz w:val="24"/>
-          <w:szCs w:val="24"/>
-        </w:rPr>
-      </w:pPr>
-      <w:r>
-        <w:rPr>
-          <w:sz w:val="24"/>
-          <w:szCs w:val="24"/>
-          <w:rtl w:val="0"/>
-        </w:rPr>
-        <w:t xml:space="preserve">• Audit Logs</w:t>
-      </w:r>
-    </w:p>
-    <w:p>
-      <w:pPr>
-        <w:pBdr>
-          <w:top w:color="auto" w:space="0" w:sz="0" w:val="none"/>
-          <w:bottom w:color="auto" w:space="0" w:sz="0" w:val="none"/>
-          <w:right w:color="auto" w:space="0" w:sz="0" w:val="none"/>
-          <w:between w:color="auto" w:space="0" w:sz="0" w:val="none"/>
-        </w:pBdr>
-        <w:ind w:left="720" w:firstLine="0"/>
-        <w:rPr>
-          <w:sz w:val="24"/>
-          <w:szCs w:val="24"/>
-          <w:shd w:fill="c6c6c6" w:val="clear"/>
-        </w:rPr>
-      </w:pPr>
-      <w:r>
-        <w:rPr>
-          <w:sz w:val="24"/>
-          <w:szCs w:val="24"/>
-          <w:shd w:fill="c6c6c6" w:val="clear"/>
-          <w:rtl w:val="0"/>
-        </w:rPr>
-        <w:t xml:space="preserve"> </w:t>
-      </w:r>
-    </w:p>
-    <w:p>
-      <w:pPr>
-        <w:pBdr>
-          <w:top w:color="auto" w:space="0" w:sz="0" w:val="none"/>
-          <w:left w:color="auto" w:space="0" w:sz="0" w:val="none"/>
-          <w:bottom w:color="auto" w:space="0" w:sz="0" w:val="none"/>
-          <w:right w:color="auto" w:space="0" w:sz="0" w:val="none"/>
-          <w:between w:color="auto" w:space="0" w:sz="0" w:val="none"/>
-        </w:pBdr>
-        <w:shd w:fill="ffffff" w:val="clear"/>
-        <w:spacing w:after="160" w:lineRule="auto"/>
-        <w:rPr>
-          <w:sz w:val="24"/>
-          <w:szCs w:val="24"/>
-          <w:shd w:fill="c6c6c6" w:val="clear"/>
-        </w:rPr>
-      </w:pPr>
-      <w:r>
-        <w:rPr>
-          <w:sz w:val="24"/>
-          <w:szCs w:val="24"/>
-          <w:shd w:fill="c6c6c6" w:val="clear"/>
-          <w:rtl w:val="0"/>
-        </w:rPr>
-        <w:t xml:space="preserve"> </w:t>
-      </w:r>
-    </w:p>
-    <w:p>
-      <w:pPr>
-        <w:pBdr>
-          <w:top w:color="auto" w:space="0" w:sz="0" w:val="none"/>
-          <w:left w:color="auto" w:space="0" w:sz="0" w:val="none"/>
-          <w:bottom w:color="auto" w:space="0" w:sz="0" w:val="none"/>
-          <w:right w:color="auto" w:space="0" w:sz="0" w:val="none"/>
-          <w:between w:color="auto" w:space="0" w:sz="0" w:val="none"/>
-        </w:pBdr>
-        <w:shd w:fill="ffffff" w:val="clear"/>
-        <w:spacing w:after="320" w:before="320" w:lineRule="auto"/>
-        <w:rPr>
-          <w:color w:val="0f4761"/>
-          <w:sz w:val="48"/>
-          <w:szCs w:val="48"/>
-          <w:shd w:fill="c6c6c6" w:val="clear"/>
         </w:rPr>
       </w:pPr>
       <w:r>
@@ -11241,7 +10848,785 @@
           <w:szCs w:val="48"/>
           <w:rtl w:val="0"/>
         </w:rPr>
-        <w:t xml:space="preserve">11. Future Enhancements</w:t>
+        <w:t xml:space="preserve">10. Database Normalization</w:t>
+      </w:r>
+    </w:p>
+    <w:p>
+      <w:pPr>
+        <w:pBdr>
+          <w:top w:color="auto" w:space="0" w:sz="0" w:val="none"/>
+          <w:left w:color="auto" w:space="0" w:sz="0" w:val="none"/>
+          <w:bottom w:color="auto" w:space="0" w:sz="0" w:val="none"/>
+          <w:right w:color="auto" w:space="0" w:sz="0" w:val="none"/>
+          <w:between w:color="auto" w:space="0" w:sz="0" w:val="none"/>
+        </w:pBdr>
+        <w:shd w:fill="ffffff" w:val="clear"/>
+        <w:spacing w:after="240" w:before="240" w:lineRule="auto"/>
+        <w:rPr>
+          <w:sz w:val="24"/>
+          <w:szCs w:val="24"/>
+        </w:rPr>
+      </w:pPr>
+      <w:r>
+        <w:rPr>
+          <w:b w:val="1"/>
+          <w:bCs w:val="1"/>
+          <w:sz w:val="24"/>
+          <w:szCs w:val="24"/>
+          <w:rtl w:val="0"/>
+        </w:rPr>
+        <w:t xml:space="preserve">1NF (First Normal Form):</w:t>
+      </w:r>
+      <w:r>
+        <w:rPr>
+          <w:sz w:val="24"/>
+          <w:szCs w:val="24"/>
+          <w:rtl w:val="0"/>
+        </w:rPr>
+        <w:t xml:space="preserve"> All database tables contain atomic values, and repeating groups or multi-valued attributes are avoided.</w:t>
+      </w:r>
+    </w:p>
+    <w:p>
+      <w:pPr>
+        <w:pBdr>
+          <w:top w:color="auto" w:space="0" w:sz="0" w:val="none"/>
+          <w:left w:color="auto" w:space="0" w:sz="0" w:val="none"/>
+          <w:bottom w:color="auto" w:space="0" w:sz="0" w:val="none"/>
+          <w:right w:color="auto" w:space="0" w:sz="0" w:val="none"/>
+          <w:between w:color="auto" w:space="0" w:sz="0" w:val="none"/>
+        </w:pBdr>
+        <w:shd w:fill="ffffff" w:val="clear"/>
+        <w:spacing w:after="240" w:before="240" w:lineRule="auto"/>
+        <w:rPr>
+          <w:sz w:val="24"/>
+          <w:szCs w:val="24"/>
+        </w:rPr>
+      </w:pPr>
+      <w:r>
+        <w:rPr>
+          <w:b w:val="1"/>
+          <w:bCs w:val="1"/>
+          <w:sz w:val="24"/>
+          <w:szCs w:val="24"/>
+          <w:rtl w:val="0"/>
+        </w:rPr>
+        <w:t xml:space="preserve">2NF (Second Normal Form):</w:t>
+      </w:r>
+      <w:r>
+        <w:rPr>
+          <w:sz w:val="24"/>
+          <w:szCs w:val="24"/>
+          <w:rtl w:val="0"/>
+        </w:rPr>
+        <w:t xml:space="preserve"> Non-key attributes are fully dependent on their respective primary keys, eliminating partial dependencies.</w:t>
+      </w:r>
+    </w:p>
+    <w:p>
+      <w:pPr>
+        <w:pBdr>
+          <w:top w:color="auto" w:space="0" w:sz="0" w:val="none"/>
+          <w:left w:color="auto" w:space="0" w:sz="0" w:val="none"/>
+          <w:bottom w:color="auto" w:space="0" w:sz="0" w:val="none"/>
+          <w:right w:color="auto" w:space="0" w:sz="0" w:val="none"/>
+          <w:between w:color="auto" w:space="0" w:sz="0" w:val="none"/>
+        </w:pBdr>
+        <w:shd w:fill="ffffff" w:val="clear"/>
+        <w:spacing w:after="240" w:before="240" w:lineRule="auto"/>
+        <w:rPr>
+          <w:sz w:val="24"/>
+          <w:szCs w:val="24"/>
+        </w:rPr>
+      </w:pPr>
+      <w:r>
+        <w:rPr>
+          <w:b w:val="1"/>
+          <w:bCs w:val="1"/>
+          <w:sz w:val="24"/>
+          <w:szCs w:val="24"/>
+          <w:rtl w:val="0"/>
+        </w:rPr>
+        <w:t xml:space="preserve">3NF (Third Normal Form):</w:t>
+      </w:r>
+      <w:r>
+        <w:rPr>
+          <w:sz w:val="24"/>
+          <w:szCs w:val="24"/>
+          <w:rtl w:val="0"/>
+        </w:rPr>
+        <w:t xml:space="preserve"> Transitive dependencies are minimized by separating independent entities such as Employees, Categories, Vendors, Users, and Assets into dedicated tables.</w:t>
+      </w:r>
+    </w:p>
+    <w:p>
+      <w:pPr>
+        <w:pBdr>
+          <w:top w:color="auto" w:space="0" w:sz="0" w:val="none"/>
+          <w:left w:color="auto" w:space="0" w:sz="0" w:val="none"/>
+          <w:bottom w:color="auto" w:space="0" w:sz="0" w:val="none"/>
+          <w:right w:color="auto" w:space="0" w:sz="0" w:val="none"/>
+          <w:between w:color="auto" w:space="0" w:sz="0" w:val="none"/>
+        </w:pBdr>
+        <w:shd w:fill="ffffff" w:val="clear"/>
+        <w:spacing w:after="240" w:before="240" w:lineRule="auto"/>
+        <w:rPr>
+          <w:sz w:val="24"/>
+          <w:szCs w:val="24"/>
+        </w:rPr>
+      </w:pPr>
+      <w:r>
+        <w:rPr>
+          <w:b w:val="1"/>
+          <w:bCs w:val="1"/>
+          <w:sz w:val="24"/>
+          <w:szCs w:val="24"/>
+          <w:rtl w:val="0"/>
+        </w:rPr>
+        <w:t xml:space="preserve">4NF (Fourth Normal Form):</w:t>
+      </w:r>
+      <w:r>
+        <w:rPr>
+          <w:sz w:val="24"/>
+          <w:szCs w:val="24"/>
+          <w:rtl w:val="0"/>
+        </w:rPr>
+        <w:t xml:space="preserve"> Independent multi-valued relationships are separated into dedicated tables such as Assignments, Maintenance, and Software Licenses to reduce redundancy and maintain data integrity.</w:t>
+      </w:r>
+    </w:p>
+    <w:p>
+      <w:pPr>
+        <w:pBdr>
+          <w:top w:color="auto" w:space="0" w:sz="0" w:val="none"/>
+          <w:left w:color="auto" w:space="0" w:sz="0" w:val="none"/>
+          <w:bottom w:color="auto" w:space="0" w:sz="0" w:val="none"/>
+          <w:right w:color="auto" w:space="0" w:sz="0" w:val="none"/>
+          <w:between w:color="auto" w:space="0" w:sz="0" w:val="none"/>
+        </w:pBdr>
+        <w:shd w:fill="ffffff" w:val="clear"/>
+        <w:spacing w:after="240" w:before="240" w:lineRule="auto"/>
+        <w:rPr>
+          <w:sz w:val="24"/>
+          <w:szCs w:val="24"/>
+        </w:rPr>
+      </w:pPr>
+      <w:r>
+        <w:rPr>
+          <w:b w:val="1"/>
+          <w:bCs w:val="1"/>
+          <w:sz w:val="24"/>
+          <w:szCs w:val="24"/>
+          <w:rtl w:val="0"/>
+        </w:rPr>
+        <w:t xml:space="preserve">Primary Key–Foreign Key Joins:</w:t>
+      </w:r>
+      <w:r>
+        <w:rPr>
+          <w:sz w:val="24"/>
+          <w:szCs w:val="24"/>
+          <w:rtl w:val="0"/>
+        </w:rPr>
+        <w:t xml:space="preserve"> The database uses PK–FK relationships to connect related entities. Assets are linked with Categories and Vendors, Assignments connects Employees with Assets, Maintenance and Software Licenses are linked with Assets, and Audit Logs are linked with Users.</w:t>
+      </w:r>
+    </w:p>
+    <w:p>
+      <w:pPr>
+        <w:pBdr>
+          <w:top w:color="auto" w:space="0" w:sz="0" w:val="none"/>
+          <w:left w:color="auto" w:space="0" w:sz="0" w:val="none"/>
+          <w:bottom w:color="auto" w:space="0" w:sz="0" w:val="none"/>
+          <w:right w:color="auto" w:space="0" w:sz="0" w:val="none"/>
+          <w:between w:color="auto" w:space="0" w:sz="0" w:val="none"/>
+        </w:pBdr>
+        <w:shd w:fill="ffffff" w:val="clear"/>
+        <w:ind w:left="720" w:firstLine="0"/>
+        <w:rPr>
+          <w:b w:val="1"/>
+          <w:bCs w:val="1"/>
+          <w:sz w:val="24"/>
+          <w:szCs w:val="24"/>
+        </w:rPr>
+      </w:pPr>
+      <w:r>
+        <w:rPr>
+          <w:b w:val="1"/>
+          <w:bCs w:val="1"/>
+          <w:sz w:val="24"/>
+          <w:szCs w:val="24"/>
+          <w:rtl w:val="0"/>
+        </w:rPr>
+        <w:t xml:space="preserve">Relationships and Joins:</w:t>
+      </w:r>
+    </w:p>
+    <w:p>
+      <w:pPr>
+        <w:pBdr>
+          <w:top w:color="auto" w:space="0" w:sz="0" w:val="none"/>
+          <w:left w:color="auto" w:space="0" w:sz="0" w:val="none"/>
+          <w:bottom w:color="auto" w:space="0" w:sz="0" w:val="none"/>
+          <w:right w:color="auto" w:space="0" w:sz="0" w:val="none"/>
+          <w:between w:color="auto" w:space="0" w:sz="0" w:val="none"/>
+        </w:pBdr>
+        <w:shd w:fill="ffffff" w:val="clear"/>
+        <w:ind w:left="720" w:firstLine="0"/>
+        <w:rPr>
+          <w:rFonts w:ascii="Roboto Mono" w:cs="Roboto Mono" w:eastAsia="Roboto Mono" w:hAnsi="Roboto Mono"/>
+          <w:color w:val="188038"/>
+          <w:sz w:val="24"/>
+          <w:szCs w:val="24"/>
+        </w:rPr>
+      </w:pPr>
+      <w:r>
+        <w:rPr>
+          <w:rFonts w:ascii="Nova Mono" w:cs="Nova Mono" w:eastAsia="Nova Mono" w:hAnsi="Nova Mono"/>
+          <w:color w:val="188038"/>
+          <w:sz w:val="24"/>
+          <w:szCs w:val="24"/>
+          <w:rtl w:val="0"/>
+        </w:rPr>
+        <w:t xml:space="preserve">Categories → Assets → Assignments ← Employees</w:t>
+      </w:r>
+    </w:p>
+    <w:p>
+      <w:pPr>
+        <w:pBdr>
+          <w:top w:color="auto" w:space="0" w:sz="0" w:val="none"/>
+          <w:left w:color="auto" w:space="0" w:sz="0" w:val="none"/>
+          <w:bottom w:color="auto" w:space="0" w:sz="0" w:val="none"/>
+          <w:right w:color="auto" w:space="0" w:sz="0" w:val="none"/>
+          <w:between w:color="auto" w:space="0" w:sz="0" w:val="none"/>
+        </w:pBdr>
+        <w:shd w:fill="ffffff" w:val="clear"/>
+        <w:ind w:left="720" w:firstLine="0"/>
+        <w:rPr>
+          <w:rFonts w:ascii="Roboto Mono" w:cs="Roboto Mono" w:eastAsia="Roboto Mono" w:hAnsi="Roboto Mono"/>
+          <w:color w:val="188038"/>
+          <w:sz w:val="24"/>
+          <w:szCs w:val="24"/>
+        </w:rPr>
+      </w:pPr>
+      <w:r>
+        <w:rPr>
+          <w:rFonts w:ascii="Nova Mono" w:cs="Nova Mono" w:eastAsia="Nova Mono" w:hAnsi="Nova Mono"/>
+          <w:color w:val="188038"/>
+          <w:sz w:val="24"/>
+          <w:szCs w:val="24"/>
+          <w:rtl w:val="0"/>
+        </w:rPr>
+        <w:t xml:space="preserve">Vendors → Assets</w:t>
+      </w:r>
+    </w:p>
+    <w:p>
+      <w:pPr>
+        <w:pBdr>
+          <w:top w:color="auto" w:space="0" w:sz="0" w:val="none"/>
+          <w:left w:color="auto" w:space="0" w:sz="0" w:val="none"/>
+          <w:bottom w:color="auto" w:space="0" w:sz="0" w:val="none"/>
+          <w:right w:color="auto" w:space="0" w:sz="0" w:val="none"/>
+          <w:between w:color="auto" w:space="0" w:sz="0" w:val="none"/>
+        </w:pBdr>
+        <w:shd w:fill="ffffff" w:val="clear"/>
+        <w:ind w:left="720" w:firstLine="0"/>
+        <w:rPr>
+          <w:rFonts w:ascii="Roboto Mono" w:cs="Roboto Mono" w:eastAsia="Roboto Mono" w:hAnsi="Roboto Mono"/>
+          <w:color w:val="188038"/>
+          <w:sz w:val="24"/>
+          <w:szCs w:val="24"/>
+        </w:rPr>
+      </w:pPr>
+      <w:r>
+        <w:rPr>
+          <w:rFonts w:ascii="Nova Mono" w:cs="Nova Mono" w:eastAsia="Nova Mono" w:hAnsi="Nova Mono"/>
+          <w:color w:val="188038"/>
+          <w:sz w:val="24"/>
+          <w:szCs w:val="24"/>
+          <w:rtl w:val="0"/>
+        </w:rPr>
+        <w:t xml:space="preserve">Assets → Maintenance</w:t>
+      </w:r>
+    </w:p>
+    <w:p>
+      <w:pPr>
+        <w:pBdr>
+          <w:top w:color="auto" w:space="0" w:sz="0" w:val="none"/>
+          <w:left w:color="auto" w:space="0" w:sz="0" w:val="none"/>
+          <w:bottom w:color="auto" w:space="0" w:sz="0" w:val="none"/>
+          <w:right w:color="auto" w:space="0" w:sz="0" w:val="none"/>
+          <w:between w:color="auto" w:space="0" w:sz="0" w:val="none"/>
+        </w:pBdr>
+        <w:shd w:fill="ffffff" w:val="clear"/>
+        <w:ind w:left="720" w:firstLine="0"/>
+        <w:rPr>
+          <w:rFonts w:ascii="Roboto Mono" w:cs="Roboto Mono" w:eastAsia="Roboto Mono" w:hAnsi="Roboto Mono"/>
+          <w:color w:val="188038"/>
+          <w:sz w:val="24"/>
+          <w:szCs w:val="24"/>
+        </w:rPr>
+      </w:pPr>
+      <w:r>
+        <w:rPr>
+          <w:rFonts w:ascii="Nova Mono" w:cs="Nova Mono" w:eastAsia="Nova Mono" w:hAnsi="Nova Mono"/>
+          <w:color w:val="188038"/>
+          <w:sz w:val="24"/>
+          <w:szCs w:val="24"/>
+          <w:rtl w:val="0"/>
+        </w:rPr>
+        <w:t xml:space="preserve">Assets → Software Licenses</w:t>
+      </w:r>
+    </w:p>
+    <w:p>
+      <w:pPr>
+        <w:pBdr>
+          <w:top w:color="auto" w:space="0" w:sz="0" w:val="none"/>
+          <w:left w:color="auto" w:space="0" w:sz="0" w:val="none"/>
+          <w:bottom w:color="auto" w:space="0" w:sz="0" w:val="none"/>
+          <w:right w:color="auto" w:space="0" w:sz="0" w:val="none"/>
+          <w:between w:color="auto" w:space="0" w:sz="0" w:val="none"/>
+        </w:pBdr>
+        <w:shd w:fill="ffffff" w:val="clear"/>
+        <w:ind w:left="720" w:firstLine="0"/>
+        <w:rPr>
+          <w:sz w:val="24"/>
+          <w:szCs w:val="24"/>
+        </w:rPr>
+      </w:pPr>
+      <w:r>
+        <w:rPr>
+          <w:rFonts w:ascii="Nova Mono" w:cs="Nova Mono" w:eastAsia="Nova Mono" w:hAnsi="Nova Mono"/>
+          <w:color w:val="188038"/>
+          <w:sz w:val="24"/>
+          <w:szCs w:val="24"/>
+          <w:rtl w:val="0"/>
+        </w:rPr>
+        <w:t xml:space="preserve">Users → Audit Logs</w:t>
+      </w:r>
+      <w:r>
+        <w:rPr>
+          <w:sz w:val="24"/>
+          <w:szCs w:val="24"/>
+          <w:rtl w:val="0"/>
+        </w:rPr>
+        <w:t xml:space="preserve"> </w:t>
+      </w:r>
+    </w:p>
+    <w:p>
+      <w:pPr>
+        <w:pBdr>
+          <w:top w:color="auto" w:space="0" w:sz="0" w:val="none"/>
+          <w:left w:color="auto" w:space="0" w:sz="0" w:val="none"/>
+          <w:bottom w:color="auto" w:space="0" w:sz="0" w:val="none"/>
+          <w:right w:color="auto" w:space="0" w:sz="0" w:val="none"/>
+          <w:between w:color="auto" w:space="0" w:sz="0" w:val="none"/>
+        </w:pBdr>
+        <w:shd w:fill="ffffff" w:val="clear"/>
+        <w:rPr>
+          <w:color w:val="0f4761"/>
+          <w:sz w:val="36"/>
+          <w:szCs w:val="36"/>
+          <w:shd w:fill="c6c6c6" w:val="clear"/>
+        </w:rPr>
+      </w:pPr>
+      <w:r>
+        <w:rPr>
+          <w:b w:val="1"/>
+          <w:bCs w:val="1"/>
+          <w:color w:val="0f4761"/>
+          <w:sz w:val="48"/>
+          <w:szCs w:val="48"/>
+          <w:rtl w:val="0"/>
+        </w:rPr>
+        <w:t xml:space="preserve">11. User Interface (UI) Screens</w:t>
+      </w:r>
+      <w:r>
+        <w:rPr>
+          <w:color w:val="0f4761"/>
+          <w:sz w:val="48"/>
+          <w:szCs w:val="48"/>
+          <w:shd w:fill="c6c6c6" w:val="clear"/>
+          <w:rtl w:val="0"/>
+        </w:rPr>
+        <w:t xml:space="preserve"> </w:t>
+      </w:r>
+      <w:r>
+        <w:rPr>
+          <w:rtl w:val="0"/>
+        </w:rPr>
+      </w:r>
+    </w:p>
+    <w:p>
+      <w:pPr>
+        <w:pBdr>
+          <w:top w:color="auto" w:space="0" w:sz="0" w:val="none"/>
+          <w:bottom w:color="auto" w:space="0" w:sz="0" w:val="none"/>
+          <w:right w:color="auto" w:space="0" w:sz="0" w:val="none"/>
+          <w:between w:color="auto" w:space="0" w:sz="0" w:val="none"/>
+        </w:pBdr>
+        <w:ind w:left="720" w:firstLine="0"/>
+        <w:rPr>
+          <w:sz w:val="24"/>
+          <w:szCs w:val="24"/>
+          <w:shd w:fill="c6c6c6" w:val="clear"/>
+        </w:rPr>
+      </w:pPr>
+      <w:r>
+        <w:rPr>
+          <w:rtl w:val="0"/>
+        </w:rPr>
+      </w:r>
+    </w:p>
+    <w:p>
+      <w:pPr>
+        <w:pBdr>
+          <w:top w:color="auto" w:space="0" w:sz="0" w:val="none"/>
+          <w:bottom w:color="auto" w:space="0" w:sz="0" w:val="none"/>
+          <w:right w:color="auto" w:space="0" w:sz="0" w:val="none"/>
+          <w:between w:color="auto" w:space="0" w:sz="0" w:val="none"/>
+        </w:pBdr>
+        <w:ind w:left="720" w:firstLine="0"/>
+        <w:rPr>
+          <w:sz w:val="24"/>
+          <w:szCs w:val="24"/>
+        </w:rPr>
+      </w:pPr>
+      <w:r>
+        <w:rPr>
+          <w:sz w:val="24"/>
+          <w:szCs w:val="24"/>
+          <w:rtl w:val="0"/>
+        </w:rPr>
+        <w:t xml:space="preserve">• Login Page</w:t>
+      </w:r>
+    </w:p>
+    <w:p>
+      <w:pPr>
+        <w:pBdr>
+          <w:top w:color="auto" w:space="0" w:sz="0" w:val="none"/>
+          <w:bottom w:color="auto" w:space="0" w:sz="0" w:val="none"/>
+          <w:right w:color="auto" w:space="0" w:sz="0" w:val="none"/>
+          <w:between w:color="auto" w:space="0" w:sz="0" w:val="none"/>
+        </w:pBdr>
+        <w:ind w:left="720" w:firstLine="0"/>
+        <w:rPr>
+          <w:sz w:val="24"/>
+          <w:szCs w:val="24"/>
+        </w:rPr>
+      </w:pPr>
+      <w:r>
+        <w:rPr>
+          <w:sz w:val="24"/>
+          <w:szCs w:val="24"/>
+          <w:rtl w:val="0"/>
+        </w:rPr>
+        <w:t xml:space="preserve">• Dashboard</w:t>
+      </w:r>
+    </w:p>
+    <w:p>
+      <w:pPr>
+        <w:pBdr>
+          <w:top w:color="auto" w:space="0" w:sz="0" w:val="none"/>
+          <w:bottom w:color="auto" w:space="0" w:sz="0" w:val="none"/>
+          <w:right w:color="auto" w:space="0" w:sz="0" w:val="none"/>
+          <w:between w:color="auto" w:space="0" w:sz="0" w:val="none"/>
+        </w:pBdr>
+        <w:ind w:left="720" w:firstLine="0"/>
+        <w:rPr>
+          <w:sz w:val="24"/>
+          <w:szCs w:val="24"/>
+        </w:rPr>
+      </w:pPr>
+      <w:r>
+        <w:rPr>
+          <w:sz w:val="24"/>
+          <w:szCs w:val="24"/>
+          <w:rtl w:val="0"/>
+        </w:rPr>
+        <w:t xml:space="preserve">• Asset Management</w:t>
+      </w:r>
+    </w:p>
+    <w:p>
+      <w:pPr>
+        <w:pBdr>
+          <w:top w:color="auto" w:space="0" w:sz="0" w:val="none"/>
+          <w:bottom w:color="auto" w:space="0" w:sz="0" w:val="none"/>
+          <w:right w:color="auto" w:space="0" w:sz="0" w:val="none"/>
+          <w:between w:color="auto" w:space="0" w:sz="0" w:val="none"/>
+        </w:pBdr>
+        <w:ind w:left="720" w:firstLine="0"/>
+        <w:rPr>
+          <w:sz w:val="24"/>
+          <w:szCs w:val="24"/>
+        </w:rPr>
+      </w:pPr>
+      <w:r>
+        <w:rPr>
+          <w:sz w:val="24"/>
+          <w:szCs w:val="24"/>
+          <w:rtl w:val="0"/>
+        </w:rPr>
+        <w:t xml:space="preserve">• Employee Management</w:t>
+      </w:r>
+    </w:p>
+    <w:p>
+      <w:pPr>
+        <w:pBdr>
+          <w:top w:color="auto" w:space="0" w:sz="0" w:val="none"/>
+          <w:bottom w:color="auto" w:space="0" w:sz="0" w:val="none"/>
+          <w:right w:color="auto" w:space="0" w:sz="0" w:val="none"/>
+          <w:between w:color="auto" w:space="0" w:sz="0" w:val="none"/>
+        </w:pBdr>
+        <w:ind w:left="720" w:firstLine="0"/>
+        <w:rPr>
+          <w:sz w:val="24"/>
+          <w:szCs w:val="24"/>
+        </w:rPr>
+      </w:pPr>
+      <w:r>
+        <w:rPr>
+          <w:sz w:val="24"/>
+          <w:szCs w:val="24"/>
+          <w:rtl w:val="0"/>
+        </w:rPr>
+        <w:t xml:space="preserve">• Asset Assignment</w:t>
+      </w:r>
+    </w:p>
+    <w:p>
+      <w:pPr>
+        <w:pBdr>
+          <w:top w:color="auto" w:space="0" w:sz="0" w:val="none"/>
+          <w:bottom w:color="auto" w:space="0" w:sz="0" w:val="none"/>
+          <w:right w:color="auto" w:space="0" w:sz="0" w:val="none"/>
+          <w:between w:color="auto" w:space="0" w:sz="0" w:val="none"/>
+        </w:pBdr>
+        <w:ind w:left="720" w:firstLine="0"/>
+        <w:rPr>
+          <w:sz w:val="24"/>
+          <w:szCs w:val="24"/>
+        </w:rPr>
+      </w:pPr>
+      <w:r>
+        <w:rPr>
+          <w:sz w:val="24"/>
+          <w:szCs w:val="24"/>
+          <w:rtl w:val="0"/>
+        </w:rPr>
+        <w:t xml:space="preserve">• Maintenance Management</w:t>
+      </w:r>
+    </w:p>
+    <w:p>
+      <w:pPr>
+        <w:pBdr>
+          <w:top w:color="auto" w:space="0" w:sz="0" w:val="none"/>
+          <w:bottom w:color="auto" w:space="0" w:sz="0" w:val="none"/>
+          <w:right w:color="auto" w:space="0" w:sz="0" w:val="none"/>
+          <w:between w:color="auto" w:space="0" w:sz="0" w:val="none"/>
+        </w:pBdr>
+        <w:ind w:left="720" w:firstLine="0"/>
+        <w:rPr>
+          <w:sz w:val="24"/>
+          <w:szCs w:val="24"/>
+        </w:rPr>
+      </w:pPr>
+      <w:r>
+        <w:rPr>
+          <w:sz w:val="24"/>
+          <w:szCs w:val="24"/>
+          <w:rtl w:val="0"/>
+        </w:rPr>
+        <w:t xml:space="preserve">• Warranty Tracking</w:t>
+      </w:r>
+    </w:p>
+    <w:p>
+      <w:pPr>
+        <w:pBdr>
+          <w:top w:color="auto" w:space="0" w:sz="0" w:val="none"/>
+          <w:bottom w:color="auto" w:space="0" w:sz="0" w:val="none"/>
+          <w:right w:color="auto" w:space="0" w:sz="0" w:val="none"/>
+          <w:between w:color="auto" w:space="0" w:sz="0" w:val="none"/>
+        </w:pBdr>
+        <w:ind w:left="720" w:firstLine="0"/>
+        <w:rPr>
+          <w:sz w:val="24"/>
+          <w:szCs w:val="24"/>
+        </w:rPr>
+      </w:pPr>
+      <w:r>
+        <w:rPr>
+          <w:sz w:val="24"/>
+          <w:szCs w:val="24"/>
+          <w:rtl w:val="0"/>
+        </w:rPr>
+        <w:t xml:space="preserve">• Software License Tracking</w:t>
+      </w:r>
+    </w:p>
+    <w:p>
+      <w:pPr>
+        <w:pBdr>
+          <w:top w:color="auto" w:space="0" w:sz="0" w:val="none"/>
+          <w:bottom w:color="auto" w:space="0" w:sz="0" w:val="none"/>
+          <w:right w:color="auto" w:space="0" w:sz="0" w:val="none"/>
+          <w:between w:color="auto" w:space="0" w:sz="0" w:val="none"/>
+        </w:pBdr>
+        <w:ind w:left="720" w:firstLine="0"/>
+        <w:rPr>
+          <w:sz w:val="24"/>
+          <w:szCs w:val="24"/>
+        </w:rPr>
+      </w:pPr>
+      <w:r>
+        <w:rPr>
+          <w:sz w:val="24"/>
+          <w:szCs w:val="24"/>
+          <w:rtl w:val="0"/>
+        </w:rPr>
+        <w:t xml:space="preserve">• QR Code Management</w:t>
+      </w:r>
+    </w:p>
+    <w:p>
+      <w:pPr>
+        <w:pBdr>
+          <w:top w:color="auto" w:space="0" w:sz="0" w:val="none"/>
+          <w:bottom w:color="auto" w:space="0" w:sz="0" w:val="none"/>
+          <w:right w:color="auto" w:space="0" w:sz="0" w:val="none"/>
+          <w:between w:color="auto" w:space="0" w:sz="0" w:val="none"/>
+        </w:pBdr>
+        <w:ind w:left="720" w:firstLine="0"/>
+        <w:rPr>
+          <w:sz w:val="24"/>
+          <w:szCs w:val="24"/>
+        </w:rPr>
+      </w:pPr>
+      <w:r>
+        <w:rPr>
+          <w:sz w:val="24"/>
+          <w:szCs w:val="24"/>
+          <w:rtl w:val="0"/>
+        </w:rPr>
+        <w:t xml:space="preserve">• Inventory Dashboard</w:t>
+      </w:r>
+    </w:p>
+    <w:p>
+      <w:pPr>
+        <w:pBdr>
+          <w:top w:color="auto" w:space="0" w:sz="0" w:val="none"/>
+          <w:bottom w:color="auto" w:space="0" w:sz="0" w:val="none"/>
+          <w:right w:color="auto" w:space="0" w:sz="0" w:val="none"/>
+          <w:between w:color="auto" w:space="0" w:sz="0" w:val="none"/>
+        </w:pBdr>
+        <w:ind w:left="720" w:firstLine="0"/>
+        <w:rPr>
+          <w:sz w:val="24"/>
+          <w:szCs w:val="24"/>
+        </w:rPr>
+      </w:pPr>
+      <w:r>
+        <w:rPr>
+          <w:sz w:val="24"/>
+          <w:szCs w:val="24"/>
+          <w:rtl w:val="0"/>
+        </w:rPr>
+        <w:t xml:space="preserve">• Reports</w:t>
+      </w:r>
+    </w:p>
+    <w:p>
+      <w:pPr>
+        <w:pBdr>
+          <w:top w:color="auto" w:space="0" w:sz="0" w:val="none"/>
+          <w:bottom w:color="auto" w:space="0" w:sz="0" w:val="none"/>
+          <w:right w:color="auto" w:space="0" w:sz="0" w:val="none"/>
+          <w:between w:color="auto" w:space="0" w:sz="0" w:val="none"/>
+        </w:pBdr>
+        <w:ind w:left="720" w:firstLine="0"/>
+        <w:rPr>
+          <w:sz w:val="24"/>
+          <w:szCs w:val="24"/>
+        </w:rPr>
+      </w:pPr>
+      <w:r>
+        <w:rPr>
+          <w:sz w:val="24"/>
+          <w:szCs w:val="24"/>
+          <w:rtl w:val="0"/>
+        </w:rPr>
+        <w:t xml:space="preserve">• Audit Logs</w:t>
+      </w:r>
+    </w:p>
+    <w:p>
+      <w:pPr>
+        <w:pBdr>
+          <w:top w:color="auto" w:space="0" w:sz="0" w:val="none"/>
+          <w:bottom w:color="auto" w:space="0" w:sz="0" w:val="none"/>
+          <w:right w:color="auto" w:space="0" w:sz="0" w:val="none"/>
+          <w:between w:color="auto" w:space="0" w:sz="0" w:val="none"/>
+        </w:pBdr>
+        <w:ind w:left="720" w:firstLine="0"/>
+        <w:rPr>
+          <w:sz w:val="24"/>
+          <w:szCs w:val="24"/>
+          <w:shd w:fill="c6c6c6" w:val="clear"/>
+        </w:rPr>
+      </w:pPr>
+      <w:r>
+        <w:rPr>
+          <w:sz w:val="24"/>
+          <w:szCs w:val="24"/>
+          <w:shd w:fill="c6c6c6" w:val="clear"/>
+          <w:rtl w:val="0"/>
+        </w:rPr>
+        <w:t xml:space="preserve"> </w:t>
+      </w:r>
+    </w:p>
+    <w:p>
+      <w:pPr>
+        <w:pBdr>
+          <w:top w:color="auto" w:space="0" w:sz="0" w:val="none"/>
+          <w:left w:color="auto" w:space="0" w:sz="0" w:val="none"/>
+          <w:bottom w:color="auto" w:space="0" w:sz="0" w:val="none"/>
+          <w:right w:color="auto" w:space="0" w:sz="0" w:val="none"/>
+          <w:between w:color="auto" w:space="0" w:sz="0" w:val="none"/>
+        </w:pBdr>
+        <w:shd w:fill="ffffff" w:val="clear"/>
+        <w:spacing w:after="160" w:lineRule="auto"/>
+        <w:rPr>
+          <w:sz w:val="24"/>
+          <w:szCs w:val="24"/>
+          <w:shd w:fill="c6c6c6" w:val="clear"/>
+        </w:rPr>
+      </w:pPr>
+      <w:r>
+        <w:rPr>
+          <w:sz w:val="24"/>
+          <w:szCs w:val="24"/>
+          <w:shd w:fill="c6c6c6" w:val="clear"/>
+          <w:rtl w:val="0"/>
+        </w:rPr>
+        <w:t xml:space="preserve"> </w:t>
+      </w:r>
+    </w:p>
+    <w:p>
+      <w:pPr>
+        <w:pBdr>
+          <w:top w:color="auto" w:space="0" w:sz="0" w:val="none"/>
+          <w:left w:color="auto" w:space="0" w:sz="0" w:val="none"/>
+          <w:bottom w:color="auto" w:space="0" w:sz="0" w:val="none"/>
+          <w:right w:color="auto" w:space="0" w:sz="0" w:val="none"/>
+          <w:between w:color="auto" w:space="0" w:sz="0" w:val="none"/>
+        </w:pBdr>
+        <w:shd w:fill="ffffff" w:val="clear"/>
+        <w:spacing w:after="320" w:before="320" w:lineRule="auto"/>
+        <w:rPr>
+          <w:color w:val="0f4761"/>
+          <w:sz w:val="48"/>
+          <w:szCs w:val="48"/>
+          <w:shd w:fill="c6c6c6" w:val="clear"/>
+        </w:rPr>
+      </w:pPr>
+      <w:r>
+        <w:rPr>
+          <w:b w:val="1"/>
+          <w:bCs w:val="1"/>
+          <w:color w:val="0f4761"/>
+          <w:sz w:val="48"/>
+          <w:szCs w:val="48"/>
+          <w:rtl w:val="0"/>
+        </w:rPr>
+        <w:t xml:space="preserve">12. Future Enhancements</w:t>
       </w:r>
       <w:r>
         <w:rPr>

</xml_diff>